<commit_message>
docs: actividades de las clases 10 y 11
</commit_message>
<xml_diff>
--- a/actividad_integradora_clase10/Clase10_GrupoN_Palco.docx
+++ b/actividad_integradora_clase10/Clase10_GrupoN_Palco.docx
@@ -3591,7 +3591,7 @@
           <w:sz w:val="21"/>
           <w:szCs w:val="21"/>
         </w:rPr>
-        <w:t xml:space="preserve">Estado actual del repo: el servicio de Eventos responde errores con {estado, mensaje, campos} (ErrorRespuesta). Falta migrarlo a Problem Details con un ExceptionMapper común en backend/common; está planificado en la tarea de ventas.</w:t>
+        <w:t xml:space="preserve">Estado actual del repo: el servicio de Eventos ya responde los errores en Problem Details (application/problem+json), con el record Problema y los ExceptionMapper comunes de backend/common (ManejadoresDeErrores). Por ejemplo, GET /api/eventos/{slug} de un evento que no existe devuelve 404 con type /problemas/no-encontrado.</w:t>
       </w:r>
     </w:p>
     <w:p>
@@ -3895,7 +3895,7 @@
           <w:sz w:val="21"/>
           <w:szCs w:val="21"/>
         </w:rPr>
-        <w:t xml:space="preserve">GET /api/eventos y GET /api/eventos/{slug} ya están implementados con Jakarta REST (JAX-RS) en el servicio de Eventos, con @PermitAll y el POST con @RolesAllowed("organizer"). Falta subir el prefijo /v1 y probarlos en Postman.</w:t>
+        <w:t xml:space="preserve">GET /api/eventos y GET /api/eventos/{slug} ya están implementados con Jakarta REST (JAX-RS) en el servicio de Eventos, con @PermitAll y el POST con @RolesAllowed("organizer"). Ventas y Pagos ya están bajo /api/v1 (/api/v1/ventas, /api/v1/entradas y /api/v1/pagos), y los servicios nuevos van bajo ese mismo prefijo. Eventos sigue en /api/eventos: falta subirlo a /v1. Estos endpoints se prueban con la colección docs/api/palco-api.postman_collection.json.</w:t>
       </w:r>
     </w:p>
     <w:sectPr>

</xml_diff>